<commit_message>
feat: update document templates with new color schemes for headings
</commit_message>
<xml_diff>
--- a/assets/templates/docx-template-with-cover.docx
+++ b/assets/templates/docx-template-with-cover.docx
@@ -4,12 +4,7 @@
   <w:body>
     <w:sdt>
       <w:sdtPr>
-        <w:rPr>
-          <w:rFonts w:eastAsiaTheme="minorEastAsia"/>
-          <w:i w:val="0"/>
-          <w:sz w:val="22"/>
-        </w:rPr>
-        <w:id w:val="-508748505"/>
+        <w:id w:val="517211531"/>
         <w:docPartObj>
           <w:docPartGallery w:val="Cover Pages"/>
           <w:docPartUnique/>
@@ -17,7 +12,11 @@
       </w:sdtPr>
       <w:sdtEndPr>
         <w:rPr>
-          <w:noProof/>
+          <w:rFonts w:eastAsiaTheme="minorEastAsia"/>
+          <w:i w:val="0"/>
+          <w:color w:val="FFFFFF" w:themeColor="background1"/>
+          <w:sz w:val="22"/>
+          <w:szCs w:val="72"/>
         </w:rPr>
       </w:sdtEndPr>
       <w:sdtContent>
@@ -32,7 +31,7 @@
             <mc:AlternateContent>
               <mc:Choice Requires="wps">
                 <w:drawing>
-                  <wp:anchor distT="0" distB="0" distL="114300" distR="114300" simplePos="0" relativeHeight="251661312" behindDoc="0" locked="0" layoutInCell="1" allowOverlap="1" wp14:anchorId="0720BF6C" wp14:editId="3559AB71">
+                  <wp:anchor distT="0" distB="0" distL="114300" distR="114300" simplePos="0" relativeHeight="251661312" behindDoc="0" locked="0" layoutInCell="1" allowOverlap="1" wp14:anchorId="777B21C8" wp14:editId="6633AEDA">
                     <wp:simplePos x="0" y="0"/>
                     <mc:AlternateContent>
                       <mc:Choice Requires="wp14">
@@ -187,7 +186,7 @@
               </mc:Choice>
               <mc:Fallback>
                 <w:pict>
-                  <v:shapetype w14:anchorId="0720BF6C" id="_x0000_t202" coordsize="21600,21600" o:spt="202" path="m,l,21600r21600,l21600,xe">
+                  <v:shapetype w14:anchorId="777B21C8" id="_x0000_t202" coordsize="21600,21600" o:spt="202" path="m,l,21600r21600,l21600,xe">
                     <v:stroke joinstyle="miter"/>
                     <v:path gradientshapeok="t" o:connecttype="rect"/>
                   </v:shapetype>
@@ -277,7 +276,7 @@
             <mc:AlternateContent>
               <mc:Choice Requires="wps">
                 <w:drawing>
-                  <wp:anchor distT="0" distB="0" distL="114300" distR="114300" simplePos="0" relativeHeight="251660288" behindDoc="0" locked="0" layoutInCell="1" allowOverlap="1" wp14:anchorId="06CB3332" wp14:editId="3C77BA83">
+                  <wp:anchor distT="0" distB="0" distL="114300" distR="114300" simplePos="0" relativeHeight="251660288" behindDoc="0" locked="0" layoutInCell="1" allowOverlap="1" wp14:anchorId="2E25A761" wp14:editId="75930EC0">
                     <wp:simplePos x="0" y="0"/>
                     <mc:AlternateContent>
                       <mc:Choice Requires="wp14">
@@ -436,7 +435,7 @@
               </mc:Choice>
               <mc:Fallback>
                 <w:pict>
-                  <v:shape w14:anchorId="06CB3332" id="Text Box 64" o:spid="_x0000_s1027" type="#_x0000_t202" style="position:absolute;margin-left:0;margin-top:0;width:4in;height:84.25pt;z-index:251660288;visibility:visible;mso-wrap-style:square;mso-width-percent:450;mso-height-percent:0;mso-left-percent:420;mso-top-percent:175;mso-wrap-distance-left:9pt;mso-wrap-distance-top:0;mso-wrap-distance-right:9pt;mso-wrap-distance-bottom:0;mso-position-horizontal-relative:page;mso-position-vertical-relative:page;mso-width-percent:450;mso-height-percent:0;mso-left-percent:420;mso-top-percent:175;mso-width-relative:page;mso-height-relative:margin;v-text-anchor:top" o:gfxdata="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" filled="f" stroked="f" strokeweight=".5pt">
+                  <v:shape w14:anchorId="2E25A761" id="Text Box 64" o:spid="_x0000_s1027" type="#_x0000_t202" style="position:absolute;margin-left:0;margin-top:0;width:4in;height:84.25pt;z-index:251660288;visibility:visible;mso-wrap-style:square;mso-width-percent:450;mso-height-percent:0;mso-left-percent:420;mso-top-percent:175;mso-wrap-distance-left:9pt;mso-wrap-distance-top:0;mso-wrap-distance-right:9pt;mso-wrap-distance-bottom:0;mso-position-horizontal-relative:page;mso-position-vertical-relative:page;mso-width-percent:450;mso-height-percent:0;mso-left-percent:420;mso-top-percent:175;mso-width-relative:page;mso-height-relative:margin;v-text-anchor:top" o:gfxdata="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" filled="f" stroked="f" strokeweight=".5pt">
                     <v:textbox style="mso-fit-shape-to-text:t" inset="0,0,0,0">
                       <w:txbxContent>
                         <w:p>
@@ -524,12 +523,15 @@
           <w:pPr>
             <w:spacing w:before="0" w:after="160" w:line="278" w:lineRule="auto"/>
             <w:rPr>
-              <w:noProof/>
+              <w:color w:val="FFFFFF" w:themeColor="background1"/>
+              <w:sz w:val="72"/>
+              <w:szCs w:val="72"/>
             </w:rPr>
           </w:pPr>
           <w:r>
             <w:rPr>
-              <w:noProof/>
+              <w:color w:val="FFFFFF" w:themeColor="background1"/>
+              <w:szCs w:val="72"/>
             </w:rPr>
             <w:br w:type="page"/>
           </w:r>
@@ -788,9 +790,11 @@
       </w:r>
     </w:p>
     <w:p>
+      <w:proofErr w:type="spellStart"/>
       <w:r>
         <w:t>DefinitionTerm</w:t>
       </w:r>
+      <w:proofErr w:type="spellEnd"/>
     </w:p>
     <w:p>
       <w:r>
@@ -798,10 +802,12 @@
       </w:r>
     </w:p>
     <w:p>
+      <w:proofErr w:type="spellStart"/>
       <w:r>
         <w:lastRenderedPageBreak/>
         <w:t>DefinitionTerm</w:t>
       </w:r>
+      <w:proofErr w:type="spellEnd"/>
     </w:p>
     <w:p>
       <w:r>
@@ -1071,12 +1077,9 @@
     <w:p/>
     <w:p/>
     <w:sectPr>
-      <w:headerReference w:type="even" r:id="rId13"/>
-      <w:headerReference w:type="default" r:id="rId14"/>
-      <w:footerReference w:type="even" r:id="rId15"/>
-      <w:footerReference w:type="default" r:id="rId16"/>
-      <w:headerReference w:type="first" r:id="rId17"/>
-      <w:footerReference w:type="first" r:id="rId18"/>
+      <w:footerReference w:type="default" r:id="rId13"/>
+      <w:headerReference w:type="first" r:id="rId14"/>
+      <w:footerReference w:type="first" r:id="rId15"/>
       <w:pgSz w:w="12240" w:h="15840"/>
       <w:pgMar w:top="1440" w:right="1440" w:bottom="1440" w:left="1440" w:header="720" w:footer="720" w:gutter="0"/>
       <w:pgNumType w:start="0"/>
@@ -1114,16 +1117,6 @@
       <w:pStyle w:val="Footer"/>
     </w:pPr>
   </w:p>
-</w:ftr>
-</file>
-
-<file path=word/footer2.xml><?xml version="1.0" encoding="utf-8"?>
-<w:ftr xmlns:wpc="http://schemas.microsoft.com/office/word/2010/wordprocessingCanvas" xmlns:cx="http://schemas.microsoft.com/office/drawing/2014/chartex" xmlns:cx1="http://schemas.microsoft.com/office/drawing/2015/9/8/chartex" xmlns:cx2="http://schemas.microsoft.com/office/drawing/2015/10/21/chartex" xmlns:cx3="http://schemas.microsoft.com/office/drawing/2016/5/9/chartex" xmlns:cx4="http://schemas.microsoft.com/office/drawing/2016/5/10/chartex" xmlns:cx5="http://schemas.microsoft.com/office/drawing/2016/5/11/chartex" xmlns:cx6="http://schemas.microsoft.com/office/drawing/2016/5/12/chartex" xmlns:cx7="http://schemas.microsoft.com/office/drawing/2016/5/13/chartex" xmlns:cx8="http://schemas.microsoft.com/office/drawing/2016/5/14/chartex" xmlns:mc="http://schemas.openxmlformats.org/markup-compatibility/2006" xmlns:m="http://schemas.openxmlformats.org/officeDocument/2006/math" xmlns:aink="http://schemas.microsoft.com/office/drawing/2016/ink" xmlns:am3d="http://schemas.microsoft.com/office/drawing/2017/model3d" xmlns:oel="http://schemas.microsoft.com/office/2019/extlst" xmlns:r="http://schemas.openxmlformats.org/officeDocument/2006/relationships" xmlns:wp14="http://schemas.microsoft.com/office/word/2010/wordprocessingDrawing" xmlns:wp="http://schemas.openxmlformats.org/drawingml/2006/wordprocessingDrawing" xmlns:wpg="http://schemas.microsoft.com/office/word/2010/wordprocessingGroup" xmlns:wpi="http://schemas.microsoft.com/office/word/2010/wordprocessingInk" xmlns:wps="http://schemas.microsoft.com/office/word/2010/wordprocessingShape" xmlns:o="urn:schemas-microsoft-com:office:office" xmlns:v="urn:schemas-microsoft-com:vml" xmlns:w10="urn:schemas-microsoft-com:office:word" xmlns:w="http://schemas.openxmlformats.org/wordprocessingml/2006/main" xmlns:w14="http://schemas.microsoft.com/office/word/2010/wordml" xmlns:w15="http://schemas.microsoft.com/office/word/2012/wordml" xmlns:w16cex="http://schemas.microsoft.com/office/word/2018/wordml/cex" xmlns:w16cid="http://schemas.microsoft.com/office/word/2016/wordml/cid" xmlns:w16="http://schemas.microsoft.com/office/word/2018/wordml" xmlns:w16sdtdh="http://schemas.microsoft.com/office/word/2020/wordml/sdtdatahash" xmlns:w16sdtfl="http://schemas.microsoft.com/office/word/2024/wordml/sdtformatlock" xmlns:w16se="http://schemas.microsoft.com/office/word/2015/wordml/symex" xmlns:w16du="http://schemas.microsoft.com/office/word/2023/wordml/word16du" xmlns:wne="http://schemas.microsoft.com/office/word/2006/wordml" mc:Ignorable="w14 w15 w16se w16cid w16 w16cex w16sdtdh w16sdtfl w16du wp14">
-  <w:p>
-    <w:pPr>
-      <w:pStyle w:val="Footer"/>
-    </w:pPr>
-  </w:p>
   <w:p>
     <w:pPr>
       <w:pStyle w:val="Footer"/>
@@ -1192,7 +1185,7 @@
 </w:ftr>
 </file>
 
-<file path=word/footer3.xml><?xml version="1.0" encoding="utf-8"?>
+<file path=word/footer2.xml><?xml version="1.0" encoding="utf-8"?>
 <w:ftr xmlns:wpc="http://schemas.microsoft.com/office/word/2010/wordprocessingCanvas" xmlns:cx="http://schemas.microsoft.com/office/drawing/2014/chartex" xmlns:cx1="http://schemas.microsoft.com/office/drawing/2015/9/8/chartex" xmlns:cx2="http://schemas.microsoft.com/office/drawing/2015/10/21/chartex" xmlns:cx3="http://schemas.microsoft.com/office/drawing/2016/5/9/chartex" xmlns:cx4="http://schemas.microsoft.com/office/drawing/2016/5/10/chartex" xmlns:cx5="http://schemas.microsoft.com/office/drawing/2016/5/11/chartex" xmlns:cx6="http://schemas.microsoft.com/office/drawing/2016/5/12/chartex" xmlns:cx7="http://schemas.microsoft.com/office/drawing/2016/5/13/chartex" xmlns:cx8="http://schemas.microsoft.com/office/drawing/2016/5/14/chartex" xmlns:mc="http://schemas.openxmlformats.org/markup-compatibility/2006" xmlns:m="http://schemas.openxmlformats.org/officeDocument/2006/math" xmlns:aink="http://schemas.microsoft.com/office/drawing/2016/ink" xmlns:am3d="http://schemas.microsoft.com/office/drawing/2017/model3d" xmlns:oel="http://schemas.microsoft.com/office/2019/extlst" xmlns:r="http://schemas.openxmlformats.org/officeDocument/2006/relationships" xmlns:wp14="http://schemas.microsoft.com/office/word/2010/wordprocessingDrawing" xmlns:wp="http://schemas.openxmlformats.org/drawingml/2006/wordprocessingDrawing" xmlns:wpg="http://schemas.microsoft.com/office/word/2010/wordprocessingGroup" xmlns:wpi="http://schemas.microsoft.com/office/word/2010/wordprocessingInk" xmlns:wps="http://schemas.microsoft.com/office/word/2010/wordprocessingShape" xmlns:o="urn:schemas-microsoft-com:office:office" xmlns:v="urn:schemas-microsoft-com:vml" xmlns:w10="urn:schemas-microsoft-com:office:word" xmlns:w="http://schemas.openxmlformats.org/wordprocessingml/2006/main" xmlns:w14="http://schemas.microsoft.com/office/word/2010/wordml" xmlns:w15="http://schemas.microsoft.com/office/word/2012/wordml" xmlns:w16cex="http://schemas.microsoft.com/office/word/2018/wordml/cex" xmlns:w16cid="http://schemas.microsoft.com/office/word/2016/wordml/cid" xmlns:w16="http://schemas.microsoft.com/office/word/2018/wordml" xmlns:w16sdtdh="http://schemas.microsoft.com/office/word/2020/wordml/sdtdatahash" xmlns:w16sdtfl="http://schemas.microsoft.com/office/word/2024/wordml/sdtformatlock" xmlns:w16se="http://schemas.microsoft.com/office/word/2015/wordml/symex" xmlns:w16du="http://schemas.microsoft.com/office/word/2023/wordml/word16du" xmlns:wne="http://schemas.microsoft.com/office/word/2006/wordml" mc:Ignorable="w14 w15 w16se w16cid w16 w16cex w16sdtdh w16sdtfl w16du wp14">
   <w:p>
     <w:pPr>
@@ -1203,28 +1196,6 @@
     <w:pPr>
       <w:pStyle w:val="Footer"/>
     </w:pPr>
-  </w:p>
-  <w:p>
-    <w:pPr>
-      <w:pStyle w:val="Footer"/>
-      <w:tabs>
-        <w:tab w:val="center" w:pos="5400"/>
-        <w:tab w:val="right" w:pos="10800"/>
-      </w:tabs>
-      <w:rPr>
-        <w:sz w:val="13"/>
-        <w:szCs w:val="13"/>
-        <w:lang w:val="en-AU"/>
-      </w:rPr>
-    </w:pPr>
-    <w:r>
-      <w:rPr>
-        <w:sz w:val="13"/>
-        <w:szCs w:val="13"/>
-        <w:lang w:val="en-AU"/>
-      </w:rPr>
-      <w:t>Generated with Pandoc for VS Code.</w:t>
-    </w:r>
   </w:p>
   <w:p>
     <w:pPr>
@@ -1296,26 +1267,6 @@
     <w:pPr>
       <w:pStyle w:val="Header"/>
     </w:pPr>
-  </w:p>
-</w:hdr>
-</file>
-
-<file path=word/header2.xml><?xml version="1.0" encoding="utf-8"?>
-<w:hdr xmlns:wpc="http://schemas.microsoft.com/office/word/2010/wordprocessingCanvas" xmlns:cx="http://schemas.microsoft.com/office/drawing/2014/chartex" xmlns:cx1="http://schemas.microsoft.com/office/drawing/2015/9/8/chartex" xmlns:cx2="http://schemas.microsoft.com/office/drawing/2015/10/21/chartex" xmlns:cx3="http://schemas.microsoft.com/office/drawing/2016/5/9/chartex" xmlns:cx4="http://schemas.microsoft.com/office/drawing/2016/5/10/chartex" xmlns:cx5="http://schemas.microsoft.com/office/drawing/2016/5/11/chartex" xmlns:cx6="http://schemas.microsoft.com/office/drawing/2016/5/12/chartex" xmlns:cx7="http://schemas.microsoft.com/office/drawing/2016/5/13/chartex" xmlns:cx8="http://schemas.microsoft.com/office/drawing/2016/5/14/chartex" xmlns:mc="http://schemas.openxmlformats.org/markup-compatibility/2006" xmlns:m="http://schemas.openxmlformats.org/officeDocument/2006/math" xmlns:aink="http://schemas.microsoft.com/office/drawing/2016/ink" xmlns:am3d="http://schemas.microsoft.com/office/drawing/2017/model3d" xmlns:oel="http://schemas.microsoft.com/office/2019/extlst" xmlns:r="http://schemas.openxmlformats.org/officeDocument/2006/relationships" xmlns:wp14="http://schemas.microsoft.com/office/word/2010/wordprocessingDrawing" xmlns:wp="http://schemas.openxmlformats.org/drawingml/2006/wordprocessingDrawing" xmlns:wpg="http://schemas.microsoft.com/office/word/2010/wordprocessingGroup" xmlns:wpi="http://schemas.microsoft.com/office/word/2010/wordprocessingInk" xmlns:wps="http://schemas.microsoft.com/office/word/2010/wordprocessingShape" xmlns:o="urn:schemas-microsoft-com:office:office" xmlns:v="urn:schemas-microsoft-com:vml" xmlns:w10="urn:schemas-microsoft-com:office:word" xmlns:w="http://schemas.openxmlformats.org/wordprocessingml/2006/main" xmlns:w14="http://schemas.microsoft.com/office/word/2010/wordml" xmlns:w15="http://schemas.microsoft.com/office/word/2012/wordml" xmlns:w16cex="http://schemas.microsoft.com/office/word/2018/wordml/cex" xmlns:w16cid="http://schemas.microsoft.com/office/word/2016/wordml/cid" xmlns:w16="http://schemas.microsoft.com/office/word/2018/wordml" xmlns:w16sdtdh="http://schemas.microsoft.com/office/word/2020/wordml/sdtdatahash" xmlns:w16sdtfl="http://schemas.microsoft.com/office/word/2024/wordml/sdtformatlock" xmlns:w16se="http://schemas.microsoft.com/office/word/2015/wordml/symex" xmlns:w16du="http://schemas.microsoft.com/office/word/2023/wordml/word16du" xmlns:wne="http://schemas.microsoft.com/office/word/2006/wordml" mc:Ignorable="w14 w15 w16se w16cid w16 w16cex w16sdtdh w16sdtfl w16du wp14">
-  <w:p>
-    <w:pPr>
-      <w:pStyle w:val="Header"/>
-    </w:pPr>
-  </w:p>
-</w:hdr>
-</file>
-
-<file path=word/header3.xml><?xml version="1.0" encoding="utf-8"?>
-<w:hdr xmlns:wpc="http://schemas.microsoft.com/office/word/2010/wordprocessingCanvas" xmlns:cx="http://schemas.microsoft.com/office/drawing/2014/chartex" xmlns:cx1="http://schemas.microsoft.com/office/drawing/2015/9/8/chartex" xmlns:cx2="http://schemas.microsoft.com/office/drawing/2015/10/21/chartex" xmlns:cx3="http://schemas.microsoft.com/office/drawing/2016/5/9/chartex" xmlns:cx4="http://schemas.microsoft.com/office/drawing/2016/5/10/chartex" xmlns:cx5="http://schemas.microsoft.com/office/drawing/2016/5/11/chartex" xmlns:cx6="http://schemas.microsoft.com/office/drawing/2016/5/12/chartex" xmlns:cx7="http://schemas.microsoft.com/office/drawing/2016/5/13/chartex" xmlns:cx8="http://schemas.microsoft.com/office/drawing/2016/5/14/chartex" xmlns:mc="http://schemas.openxmlformats.org/markup-compatibility/2006" xmlns:m="http://schemas.openxmlformats.org/officeDocument/2006/math" xmlns:aink="http://schemas.microsoft.com/office/drawing/2016/ink" xmlns:am3d="http://schemas.microsoft.com/office/drawing/2017/model3d" xmlns:oel="http://schemas.microsoft.com/office/2019/extlst" xmlns:r="http://schemas.openxmlformats.org/officeDocument/2006/relationships" xmlns:wp14="http://schemas.microsoft.com/office/word/2010/wordprocessingDrawing" xmlns:wp="http://schemas.openxmlformats.org/drawingml/2006/wordprocessingDrawing" xmlns:wpg="http://schemas.microsoft.com/office/word/2010/wordprocessingGroup" xmlns:wpi="http://schemas.microsoft.com/office/word/2010/wordprocessingInk" xmlns:wps="http://schemas.microsoft.com/office/word/2010/wordprocessingShape" xmlns:o="urn:schemas-microsoft-com:office:office" xmlns:v="urn:schemas-microsoft-com:vml" xmlns:w10="urn:schemas-microsoft-com:office:word" xmlns:w="http://schemas.openxmlformats.org/wordprocessingml/2006/main" xmlns:w14="http://schemas.microsoft.com/office/word/2010/wordml" xmlns:w15="http://schemas.microsoft.com/office/word/2012/wordml" xmlns:w16cex="http://schemas.microsoft.com/office/word/2018/wordml/cex" xmlns:w16cid="http://schemas.microsoft.com/office/word/2016/wordml/cid" xmlns:w16="http://schemas.microsoft.com/office/word/2018/wordml" xmlns:w16sdtdh="http://schemas.microsoft.com/office/word/2020/wordml/sdtdatahash" xmlns:w16sdtfl="http://schemas.microsoft.com/office/word/2024/wordml/sdtformatlock" xmlns:w16se="http://schemas.microsoft.com/office/word/2015/wordml/symex" xmlns:w16du="http://schemas.microsoft.com/office/word/2023/wordml/word16du" xmlns:wne="http://schemas.microsoft.com/office/word/2006/wordml" mc:Ignorable="w14 w15 w16se w16cid w16 w16cex w16sdtdh w16sdtfl w16du wp14">
-  <w:p>
-    <w:pPr>
-      <w:pStyle w:val="Header"/>
-    </w:pPr>
     <w:r>
       <w:rPr>
         <w:noProof/>
@@ -1323,7 +1274,7 @@
       <mc:AlternateContent>
         <mc:Choice Requires="wpg">
           <w:drawing>
-            <wp:anchor distT="0" distB="0" distL="114300" distR="114300" simplePos="0" relativeHeight="251659264" behindDoc="1" locked="0" layoutInCell="1" allowOverlap="1" wp14:anchorId="750BE41F" wp14:editId="1A561FE0">
+            <wp:anchor distT="0" distB="0" distL="114300" distR="114300" simplePos="0" relativeHeight="251659264" behindDoc="1" locked="0" layoutInCell="1" allowOverlap="1" wp14:anchorId="6ABAB809" wp14:editId="4F26607E">
               <wp:simplePos x="0" y="0"/>
               <wp:positionH relativeFrom="page">
                 <wp:posOffset>314036</wp:posOffset>
@@ -1347,12 +1298,6 @@
                         <a:chOff x="0" y="0"/>
                         <a:chExt cx="2133600" cy="9125712"/>
                       </a:xfrm>
-                      <a:solidFill>
-                        <a:schemeClr val="tx1">
-                          <a:lumMod val="75000"/>
-                          <a:lumOff val="25000"/>
-                        </a:schemeClr>
-                      </a:solidFill>
                     </wpg:grpSpPr>
                     <wps:wsp>
                       <wps:cNvPr id="3" name="Rectangle 3"/>
@@ -1365,7 +1310,9 @@
                         <a:prstGeom prst="rect">
                           <a:avLst/>
                         </a:prstGeom>
-                        <a:grpFill/>
+                        <a:solidFill>
+                          <a:schemeClr val="tx1"/>
+                        </a:solidFill>
                         <a:ln>
                           <a:noFill/>
                         </a:ln>
@@ -1403,7 +1350,6 @@
                           <a:chOff x="80645" y="4211812"/>
                           <a:chExt cx="1306273" cy="3121026"/>
                         </a:xfrm>
-                        <a:grpFill/>
                       </wpg:grpSpPr>
                       <wpg:grpSp>
                         <wpg:cNvPr id="6" name="Group 6"/>
@@ -1417,7 +1363,6 @@
                             <a:chOff x="141062" y="4211812"/>
                             <a:chExt cx="1047750" cy="3121026"/>
                           </a:xfrm>
-                          <a:grpFill/>
                         </wpg:grpSpPr>
                         <wps:wsp>
                           <wps:cNvPr id="20" name="Freeform 20"/>
@@ -1515,7 +1460,9 @@
                                 </a:path>
                               </a:pathLst>
                             </a:custGeom>
-                            <a:grpFill/>
+                            <a:solidFill>
+                              <a:schemeClr val="tx2"/>
+                            </a:solidFill>
                             <a:ln w="0">
                               <a:solidFill>
                                 <a:schemeClr val="tx2"/>
@@ -1636,7 +1583,9 @@
                                 </a:path>
                               </a:pathLst>
                             </a:custGeom>
-                            <a:grpFill/>
+                            <a:solidFill>
+                              <a:schemeClr val="tx2"/>
+                            </a:solidFill>
                             <a:ln w="0">
                               <a:solidFill>
                                 <a:schemeClr val="tx2"/>
@@ -1853,7 +1802,9 @@
                                 </a:path>
                               </a:pathLst>
                             </a:custGeom>
-                            <a:grpFill/>
+                            <a:solidFill>
+                              <a:schemeClr val="tx2"/>
+                            </a:solidFill>
                             <a:ln w="0">
                               <a:solidFill>
                                 <a:schemeClr val="tx2"/>
@@ -2054,7 +2005,9 @@
                                 </a:path>
                               </a:pathLst>
                             </a:custGeom>
-                            <a:grpFill/>
+                            <a:solidFill>
+                              <a:schemeClr val="tx2"/>
+                            </a:solidFill>
                             <a:ln w="0">
                               <a:solidFill>
                                 <a:schemeClr val="tx2"/>
@@ -2247,7 +2200,9 @@
                                 </a:path>
                               </a:pathLst>
                             </a:custGeom>
-                            <a:grpFill/>
+                            <a:solidFill>
+                              <a:schemeClr val="tx2"/>
+                            </a:solidFill>
                             <a:ln w="0">
                               <a:solidFill>
                                 <a:schemeClr val="tx2"/>
@@ -2328,7 +2283,9 @@
                                 </a:path>
                               </a:pathLst>
                             </a:custGeom>
-                            <a:grpFill/>
+                            <a:solidFill>
+                              <a:schemeClr val="tx2"/>
+                            </a:solidFill>
                             <a:ln w="0">
                               <a:solidFill>
                                 <a:schemeClr val="tx2"/>
@@ -2417,7 +2374,9 @@
                                 </a:path>
                               </a:pathLst>
                             </a:custGeom>
-                            <a:grpFill/>
+                            <a:solidFill>
+                              <a:schemeClr val="tx2"/>
+                            </a:solidFill>
                             <a:ln w="0">
                               <a:solidFill>
                                 <a:schemeClr val="tx2"/>
@@ -2706,7 +2665,9 @@
                                 </a:path>
                               </a:pathLst>
                             </a:custGeom>
-                            <a:grpFill/>
+                            <a:solidFill>
+                              <a:schemeClr val="tx2"/>
+                            </a:solidFill>
                             <a:ln w="0">
                               <a:solidFill>
                                 <a:schemeClr val="tx2"/>
@@ -2843,7 +2804,9 @@
                                 </a:path>
                               </a:pathLst>
                             </a:custGeom>
-                            <a:grpFill/>
+                            <a:solidFill>
+                              <a:schemeClr val="tx2"/>
+                            </a:solidFill>
                             <a:ln w="0">
                               <a:solidFill>
                                 <a:schemeClr val="tx2"/>
@@ -2916,7 +2879,9 @@
                                 </a:path>
                               </a:pathLst>
                             </a:custGeom>
-                            <a:grpFill/>
+                            <a:solidFill>
+                              <a:schemeClr val="tx2"/>
+                            </a:solidFill>
                             <a:ln w="0">
                               <a:solidFill>
                                 <a:schemeClr val="tx2"/>
@@ -3005,7 +2970,9 @@
                                 </a:path>
                               </a:pathLst>
                             </a:custGeom>
-                            <a:grpFill/>
+                            <a:solidFill>
+                              <a:schemeClr val="tx2"/>
+                            </a:solidFill>
                             <a:ln w="0">
                               <a:solidFill>
                                 <a:schemeClr val="tx2"/>
@@ -3118,7 +3085,9 @@
                                 </a:path>
                               </a:pathLst>
                             </a:custGeom>
-                            <a:grpFill/>
+                            <a:solidFill>
+                              <a:schemeClr val="tx2"/>
+                            </a:solidFill>
                             <a:ln w="0">
                               <a:solidFill>
                                 <a:schemeClr val="tx2"/>
@@ -3148,7 +3117,6 @@
                             <a:chOff x="80645" y="4649964"/>
                             <a:chExt cx="874712" cy="1677988"/>
                           </a:xfrm>
-                          <a:grpFill/>
                         </wpg:grpSpPr>
                         <wps:wsp>
                           <wps:cNvPr id="8" name="Freeform 8"/>
@@ -3246,7 +3214,11 @@
                                 </a:path>
                               </a:pathLst>
                             </a:custGeom>
-                            <a:grpFill/>
+                            <a:solidFill>
+                              <a:srgbClr val="C00000">
+                                <a:alpha val="20000"/>
+                              </a:srgbClr>
+                            </a:solidFill>
                             <a:ln w="0">
                               <a:solidFill>
                                 <a:schemeClr val="tx2">
@@ -3369,7 +3341,11 @@
                                 </a:path>
                               </a:pathLst>
                             </a:custGeom>
-                            <a:grpFill/>
+                            <a:solidFill>
+                              <a:srgbClr val="C00000">
+                                <a:alpha val="20000"/>
+                              </a:srgbClr>
+                            </a:solidFill>
                             <a:ln w="0">
                               <a:solidFill>
                                 <a:schemeClr val="tx2">
@@ -3460,7 +3436,11 @@
                                 </a:path>
                               </a:pathLst>
                             </a:custGeom>
-                            <a:grpFill/>
+                            <a:solidFill>
+                              <a:schemeClr val="tx2">
+                                <a:alpha val="20000"/>
+                              </a:schemeClr>
+                            </a:solidFill>
                             <a:ln w="0">
                               <a:solidFill>
                                 <a:schemeClr val="tx2">
@@ -3655,7 +3635,11 @@
                                 </a:path>
                               </a:pathLst>
                             </a:custGeom>
-                            <a:grpFill/>
+                            <a:solidFill>
+                              <a:srgbClr val="C00000">
+                                <a:alpha val="20000"/>
+                              </a:srgbClr>
+                            </a:solidFill>
                             <a:ln w="0">
                               <a:solidFill>
                                 <a:schemeClr val="tx2">
@@ -3738,7 +3722,11 @@
                                 </a:path>
                               </a:pathLst>
                             </a:custGeom>
-                            <a:grpFill/>
+                            <a:solidFill>
+                              <a:schemeClr val="tx2">
+                                <a:alpha val="20000"/>
+                              </a:schemeClr>
+                            </a:solidFill>
                             <a:ln w="0">
                               <a:solidFill>
                                 <a:schemeClr val="tx2">
@@ -3829,7 +3817,11 @@
                                 </a:path>
                               </a:pathLst>
                             </a:custGeom>
-                            <a:grpFill/>
+                            <a:solidFill>
+                              <a:schemeClr val="tx2">
+                                <a:alpha val="20000"/>
+                              </a:schemeClr>
+                            </a:solidFill>
                             <a:ln w="0">
                               <a:solidFill>
                                 <a:schemeClr val="tx2">
@@ -4120,7 +4112,11 @@
                                 </a:path>
                               </a:pathLst>
                             </a:custGeom>
-                            <a:grpFill/>
+                            <a:solidFill>
+                              <a:srgbClr val="C00000">
+                                <a:alpha val="20000"/>
+                              </a:srgbClr>
+                            </a:solidFill>
                             <a:ln w="0">
                               <a:solidFill>
                                 <a:schemeClr val="tx2">
@@ -4259,7 +4255,11 @@
                                 </a:path>
                               </a:pathLst>
                             </a:custGeom>
-                            <a:grpFill/>
+                            <a:solidFill>
+                              <a:schemeClr val="tx2">
+                                <a:alpha val="20000"/>
+                              </a:schemeClr>
+                            </a:solidFill>
                             <a:ln w="0">
                               <a:solidFill>
                                 <a:schemeClr val="tx2">
@@ -4334,7 +4334,11 @@
                                 </a:path>
                               </a:pathLst>
                             </a:custGeom>
-                            <a:grpFill/>
+                            <a:solidFill>
+                              <a:schemeClr val="tx2">
+                                <a:alpha val="20000"/>
+                              </a:schemeClr>
+                            </a:solidFill>
                             <a:ln w="0">
                               <a:solidFill>
                                 <a:schemeClr val="tx2">
@@ -4425,7 +4429,11 @@
                                 </a:path>
                               </a:pathLst>
                             </a:custGeom>
-                            <a:grpFill/>
+                            <a:solidFill>
+                              <a:schemeClr val="tx2">
+                                <a:alpha val="20000"/>
+                              </a:schemeClr>
+                            </a:solidFill>
                             <a:ln w="0">
                               <a:solidFill>
                                 <a:schemeClr val="tx2">
@@ -4540,7 +4548,11 @@
                                 </a:path>
                               </a:pathLst>
                             </a:custGeom>
-                            <a:grpFill/>
+                            <a:solidFill>
+                              <a:srgbClr val="C00000">
+                                <a:alpha val="20000"/>
+                              </a:srgbClr>
+                            </a:solidFill>
                             <a:ln w="0">
                               <a:solidFill>
                                 <a:schemeClr val="tx2">
@@ -4575,91 +4587,102 @@
         </mc:Choice>
         <mc:Fallback>
           <w:pict>
-            <v:group w14:anchorId="415AA839" id="Group 60" o:spid="_x0000_s1026" style="position:absolute;margin-left:24.75pt;margin-top:19.65pt;width:168pt;height:718.55pt;z-index:-251657216;mso-height-percent:950;mso-position-horizontal-relative:page;mso-position-vertical-relative:page;mso-height-percent:950" coordsize="21336,91257" o:gfxdata="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">
-              <v:rect id="Rectangle 3" o:spid="_x0000_s1027" style="position:absolute;width:1945;height:91257;visibility:visible;mso-wrap-style:square;v-text-anchor:middle" o:gfxdata="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" filled="f" stroked="f" strokeweight="1pt"/>
+            <v:group w14:anchorId="3785B351" id="Group 60" o:spid="_x0000_s1026" style="position:absolute;margin-left:24.75pt;margin-top:19.65pt;width:168pt;height:718.55pt;z-index:-251657216;mso-height-percent:950;mso-position-horizontal-relative:page;mso-position-vertical-relative:page;mso-height-percent:950" coordsize="21336,91257" o:gfxdata="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">
+              <v:rect id="Rectangle 3" o:spid="_x0000_s1027" style="position:absolute;width:1945;height:91257;visibility:visible;mso-wrap-style:square;v-text-anchor:middle" o:gfxdata="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" fillcolor="black [3213]" stroked="f" strokeweight="1pt"/>
               <v:group id="Group 5" o:spid="_x0000_s1028" style="position:absolute;left:762;top:42100;width:20574;height:49103" coordorigin="806,42118" coordsize="13062,31210" o:gfxdata="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">
                 <v:group id="Group 6" o:spid="_x0000_s1029" style="position:absolute;left:1410;top:42118;width:10478;height:31210" coordorigin="1410,42118" coordsize="10477,31210" o:gfxdata="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">
                   <o:lock v:ext="edit" aspectratio="t"/>
-                  <v:shape id="Freeform 20" o:spid="_x0000_s1030" style="position:absolute;left:3696;top:62168;width:1937;height:6985;visibility:visible;mso-wrap-style:square;v-text-anchor:top" coordsize="122,440" o:gfxdata="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" path="m,l39,152,84,304r38,113l122,440,76,306,39,180,6,53,,xe" filled="f" strokecolor="#0e2841 [3215]" strokeweight="0">
+                  <v:shape id="Freeform 20" o:spid="_x0000_s1030" style="position:absolute;left:3696;top:62168;width:1937;height:6985;visibility:visible;mso-wrap-style:square;v-text-anchor:top" coordsize="122,440" o:gfxdata="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" path="m,l39,152,84,304r38,113l122,440,76,306,39,180,6,53,,xe" fillcolor="#0e2841 [3215]" strokecolor="#0e2841 [3215]" strokeweight="0">
                     <v:path arrowok="t" o:connecttype="custom" o:connectlocs="0,0;61913,241300;133350,482600;193675,661988;193675,698500;120650,485775;61913,285750;9525,84138;0,0" o:connectangles="0,0,0,0,0,0,0,0,0"/>
                   </v:shape>
-                  <v:shape id="Freeform 21" o:spid="_x0000_s1031" style="position:absolute;left:5728;top:69058;width:1842;height:4270;visibility:visible;mso-wrap-style:square;v-text-anchor:top" coordsize="116,269" o:gfxdata="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" path="m,l8,19,37,93r30,74l116,269r-8,l60,169,30,98,1,25,,xe" filled="f" strokecolor="#0e2841 [3215]" strokeweight="0">
+                  <v:shape id="Freeform 21" o:spid="_x0000_s1031" style="position:absolute;left:5728;top:69058;width:1842;height:4270;visibility:visible;mso-wrap-style:square;v-text-anchor:top" coordsize="116,269" o:gfxdata="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" path="m,l8,19,37,93r30,74l116,269r-8,l60,169,30,98,1,25,,xe" fillcolor="#0e2841 [3215]" strokecolor="#0e2841 [3215]" strokeweight="0">
                     <v:path arrowok="t" o:connecttype="custom" o:connectlocs="0,0;12700,30163;58738,147638;106363,265113;184150,427038;171450,427038;95250,268288;47625,155575;1588,39688;0,0" o:connectangles="0,0,0,0,0,0,0,0,0,0"/>
                   </v:shape>
-                  <v:shape id="Freeform 22" o:spid="_x0000_s1032" style="position:absolute;left:1410;top:42118;width:2223;height:20193;visibility:visible;mso-wrap-style:square;v-text-anchor:top" coordsize="140,1272" o:gfxdata="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" path="m,l,,1,79r2,80l12,317,23,476,39,634,58,792,83,948r24,138l135,1223r5,49l138,1262,105,1106,77,949,53,792,35,634,20,476,9,317,2,159,,79,,xe" filled="f" strokecolor="#0e2841 [3215]" strokeweight="0">
+                  <v:shape id="Freeform 22" o:spid="_x0000_s1032" style="position:absolute;left:1410;top:42118;width:2223;height:20193;visibility:visible;mso-wrap-style:square;v-text-anchor:top" coordsize="140,1272" o:gfxdata="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" path="m,l,,1,79r2,80l12,317,23,476,39,634,58,792,83,948r24,138l135,1223r5,49l138,1262,105,1106,77,949,53,792,35,634,20,476,9,317,2,159,,79,,xe" fillcolor="#0e2841 [3215]" strokecolor="#0e2841 [3215]" strokeweight="0">
                     <v:path arrowok="t" o:connecttype="custom" o:connectlocs="0,0;0,0;1588,125413;4763,252413;19050,503238;36513,755650;61913,1006475;92075,1257300;131763,1504950;169863,1724025;214313,1941513;222250,2019300;219075,2003425;166688,1755775;122238,1506538;84138,1257300;55563,1006475;31750,755650;14288,503238;3175,252413;0,125413;0,0" o:connectangles="0,0,0,0,0,0,0,0,0,0,0,0,0,0,0,0,0,0,0,0,0,0"/>
                   </v:shape>
-                  <v:shape id="Freeform 23" o:spid="_x0000_s1033" style="position:absolute;left:3410;top:48611;width:715;height:13557;visibility:visible;mso-wrap-style:square;v-text-anchor:top" coordsize="45,854" o:gfxdata="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" path="m45,r,l35,66r-9,67l14,267,6,401,3,534,6,669r8,134l18,854r,-3l9,814,8,803,1,669,,534,3,401,12,267,25,132,34,66,45,xe" filled="f" strokecolor="#0e2841 [3215]" strokeweight="0">
+                  <v:shape id="Freeform 23" o:spid="_x0000_s1033" style="position:absolute;left:3410;top:48611;width:715;height:13557;visibility:visible;mso-wrap-style:square;v-text-anchor:top" coordsize="45,854" o:gfxdata="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" path="m45,r,l35,66r-9,67l14,267,6,401,3,534,6,669r8,134l18,854r,-3l9,814,8,803,1,669,,534,3,401,12,267,25,132,34,66,45,xe" fillcolor="#0e2841 [3215]" strokecolor="#0e2841 [3215]" strokeweight="0">
                     <v:path arrowok="t" o:connecttype="custom" o:connectlocs="71438,0;71438,0;55563,104775;41275,211138;22225,423863;9525,636588;4763,847725;9525,1062038;22225,1274763;28575,1355725;28575,1350963;14288,1292225;12700,1274763;1588,1062038;0,847725;4763,636588;19050,423863;39688,209550;53975,104775;71438,0" o:connectangles="0,0,0,0,0,0,0,0,0,0,0,0,0,0,0,0,0,0,0,0"/>
                   </v:shape>
-                  <v:shape id="Freeform 24" o:spid="_x0000_s1034" style="position:absolute;left:3633;top:62311;width:2444;height:9985;visibility:visible;mso-wrap-style:square;v-text-anchor:top" coordsize="154,629" o:gfxdata="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" path="m,l10,44r11,82l34,207r19,86l75,380r25,86l120,521r21,55l152,618r2,11l140,595,115,532,93,468,67,383,47,295,28,207,12,104,,xe" filled="f" strokecolor="#0e2841 [3215]" strokeweight="0">
+                  <v:shape id="Freeform 24" o:spid="_x0000_s1034" style="position:absolute;left:3633;top:62311;width:2444;height:9985;visibility:visible;mso-wrap-style:square;v-text-anchor:top" coordsize="154,629" o:gfxdata="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" path="m,l10,44r11,82l34,207r19,86l75,380r25,86l120,521r21,55l152,618r2,11l140,595,115,532,93,468,67,383,47,295,28,207,12,104,,xe" fillcolor="#0e2841 [3215]" strokecolor="#0e2841 [3215]" strokeweight="0">
                     <v:path arrowok="t" o:connecttype="custom" o:connectlocs="0,0;15875,69850;33338,200025;53975,328613;84138,465138;119063,603250;158750,739775;190500,827088;223838,914400;241300,981075;244475,998538;222250,944563;182563,844550;147638,742950;106363,608013;74613,468313;44450,328613;19050,165100;0,0" o:connectangles="0,0,0,0,0,0,0,0,0,0,0,0,0,0,0,0,0,0,0"/>
                   </v:shape>
-                  <v:shape id="Freeform 25" o:spid="_x0000_s1035" style="position:absolute;left:6204;top:72233;width:524;height:1095;visibility:visible;mso-wrap-style:square;v-text-anchor:top" coordsize="33,69" o:gfxdata="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" path="m,l33,69r-9,l12,35,,xe" filled="f" strokecolor="#0e2841 [3215]" strokeweight="0">
+                  <v:shape id="Freeform 25" o:spid="_x0000_s1035" style="position:absolute;left:6204;top:72233;width:524;height:1095;visibility:visible;mso-wrap-style:square;v-text-anchor:top" coordsize="33,69" o:gfxdata="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" path="m,l33,69r-9,l12,35,,xe" fillcolor="#0e2841 [3215]" strokecolor="#0e2841 [3215]" strokeweight="0">
                     <v:path arrowok="t" o:connecttype="custom" o:connectlocs="0,0;52388,109538;38100,109538;19050,55563;0,0" o:connectangles="0,0,0,0,0"/>
                   </v:shape>
-                  <v:shape id="Freeform 26" o:spid="_x0000_s1036" style="position:absolute;left:3553;top:61533;width:238;height:1476;visibility:visible;mso-wrap-style:square;v-text-anchor:top" coordsize="15,93" o:gfxdata="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" path="m,l9,37r,3l15,93,5,49,,xe" filled="f" strokecolor="#0e2841 [3215]" strokeweight="0">
+                  <v:shape id="Freeform 26" o:spid="_x0000_s1036" style="position:absolute;left:3553;top:61533;width:238;height:1476;visibility:visible;mso-wrap-style:square;v-text-anchor:top" coordsize="15,93" o:gfxdata="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" path="m,l9,37r,3l15,93,5,49,,xe" fillcolor="#0e2841 [3215]" strokecolor="#0e2841 [3215]" strokeweight="0">
                     <v:path arrowok="t" o:connecttype="custom" o:connectlocs="0,0;14288,58738;14288,63500;23813,147638;7938,77788;0,0" o:connectangles="0,0,0,0,0,0"/>
                   </v:shape>
-                  <v:shape id="Freeform 27" o:spid="_x0000_s1037" style="position:absolute;left:5633;top:56897;width:6255;height:12161;visibility:visible;mso-wrap-style:square;v-text-anchor:top" coordsize="394,766" o:gfxdata="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" path="m394,r,l356,38,319,77r-35,40l249,160r-42,58l168,276r-37,63l98,402,69,467,45,535,26,604,14,673,7,746,6,766,,749r1,-5l7,673,21,603,40,533,65,466,94,400r33,-64l164,275r40,-60l248,158r34,-42l318,76,354,37,394,xe" filled="f" strokecolor="#0e2841 [3215]" strokeweight="0">
+                  <v:shape id="Freeform 27" o:spid="_x0000_s1037" style="position:absolute;left:5633;top:56897;width:6255;height:12161;visibility:visible;mso-wrap-style:square;v-text-anchor:top" coordsize="394,766" o:gfxdata="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" path="m394,r,l356,38,319,77r-35,40l249,160r-42,58l168,276r-37,63l98,402,69,467,45,535,26,604,14,673,7,746,6,766,,749r1,-5l7,673,21,603,40,533,65,466,94,400r33,-64l164,275r40,-60l248,158r34,-42l318,76,354,37,394,xe" fillcolor="#0e2841 [3215]" strokecolor="#0e2841 [3215]" strokeweight="0">
                     <v:path arrowok="t" o:connecttype="custom" o:connectlocs="625475,0;625475,0;565150,60325;506413,122238;450850,185738;395288,254000;328613,346075;266700,438150;207963,538163;155575,638175;109538,741363;71438,849313;41275,958850;22225,1068388;11113,1184275;9525,1216025;0,1189038;1588,1181100;11113,1068388;33338,957263;63500,846138;103188,739775;149225,635000;201613,533400;260350,436563;323850,341313;393700,250825;447675,184150;504825,120650;561975,58738;625475,0" o:connectangles="0,0,0,0,0,0,0,0,0,0,0,0,0,0,0,0,0,0,0,0,0,0,0,0,0,0,0,0,0,0,0"/>
                   </v:shape>
-                  <v:shape id="Freeform 28" o:spid="_x0000_s1038" style="position:absolute;left:5633;top:69153;width:571;height:3080;visibility:visible;mso-wrap-style:square;v-text-anchor:top" coordsize="36,194" o:gfxdata="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" path="m,l6,16r1,3l11,80r9,52l33,185r3,9l21,161,15,145,5,81,1,41,,xe" filled="f" strokecolor="#0e2841 [3215]" strokeweight="0">
+                  <v:shape id="Freeform 28" o:spid="_x0000_s1038" style="position:absolute;left:5633;top:69153;width:571;height:3080;visibility:visible;mso-wrap-style:square;v-text-anchor:top" coordsize="36,194" o:gfxdata="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" path="m,l6,16r1,3l11,80r9,52l33,185r3,9l21,161,15,145,5,81,1,41,,xe" fillcolor="#0e2841 [3215]" strokecolor="#0e2841 [3215]" strokeweight="0">
                     <v:path arrowok="t" o:connecttype="custom" o:connectlocs="0,0;9525,25400;11113,30163;17463,127000;31750,209550;52388,293688;57150,307975;33338,255588;23813,230188;7938,128588;1588,65088;0,0" o:connectangles="0,0,0,0,0,0,0,0,0,0,0,0"/>
                   </v:shape>
-                  <v:shape id="Freeform 29" o:spid="_x0000_s1039" style="position:absolute;left:6077;top:72296;width:493;height:1032;visibility:visible;mso-wrap-style:square;v-text-anchor:top" coordsize="31,65" o:gfxdata="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" path="m,l31,65r-8,l,xe" filled="f" strokecolor="#0e2841 [3215]" strokeweight="0">
+                  <v:shape id="Freeform 29" o:spid="_x0000_s1039" style="position:absolute;left:6077;top:72296;width:493;height:1032;visibility:visible;mso-wrap-style:square;v-text-anchor:top" coordsize="31,65" o:gfxdata="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" path="m,l31,65r-8,l,xe" fillcolor="#0e2841 [3215]" strokecolor="#0e2841 [3215]" strokeweight="0">
                     <v:path arrowok="t" o:connecttype="custom" o:connectlocs="0,0;49213,103188;36513,103188;0,0" o:connectangles="0,0,0,0"/>
                   </v:shape>
-                  <v:shape id="Freeform 30" o:spid="_x0000_s1040" style="position:absolute;left:5633;top:68788;width:111;height:666;visibility:visible;mso-wrap-style:square;v-text-anchor:top" coordsize="7,42" o:gfxdata="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" path="m,l6,17,7,42,6,39,,23,,xe" filled="f" strokecolor="#0e2841 [3215]" strokeweight="0">
+                  <v:shape id="Freeform 30" o:spid="_x0000_s1040" style="position:absolute;left:5633;top:68788;width:111;height:666;visibility:visible;mso-wrap-style:square;v-text-anchor:top" coordsize="7,42" o:gfxdata="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" path="m,l6,17,7,42,6,39,,23,,xe" fillcolor="#0e2841 [3215]" strokecolor="#0e2841 [3215]" strokeweight="0">
                     <v:path arrowok="t" o:connecttype="custom" o:connectlocs="0,0;9525,26988;11113,66675;9525,61913;0,36513;0,0" o:connectangles="0,0,0,0,0,0"/>
                   </v:shape>
-                  <v:shape id="Freeform 31" o:spid="_x0000_s1041" style="position:absolute;left:5871;top:71455;width:714;height:1873;visibility:visible;mso-wrap-style:square;v-text-anchor:top" coordsize="45,118" o:gfxdata="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" path="m,l6,16,21,49,33,84r12,34l44,118,13,53,11,42,,xe" filled="f" strokecolor="#0e2841 [3215]" strokeweight="0">
+                  <v:shape id="Freeform 31" o:spid="_x0000_s1041" style="position:absolute;left:5871;top:71455;width:714;height:1873;visibility:visible;mso-wrap-style:square;v-text-anchor:top" coordsize="45,118" o:gfxdata="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" path="m,l6,16,21,49,33,84r12,34l44,118,13,53,11,42,,xe" fillcolor="#0e2841 [3215]" strokecolor="#0e2841 [3215]" strokeweight="0">
                     <v:path arrowok="t" o:connecttype="custom" o:connectlocs="0,0;9525,25400;33338,77788;52388,133350;71438,187325;69850,187325;20638,84138;17463,66675;0,0" o:connectangles="0,0,0,0,0,0,0,0,0"/>
                   </v:shape>
                 </v:group>
                 <v:group id="Group 7" o:spid="_x0000_s1042" style="position:absolute;left:806;top:48269;width:13063;height:25059" coordorigin="806,46499" coordsize="8747,16779" o:gfxdata="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">
                   <o:lock v:ext="edit" aspectratio="t"/>
-                  <v:shape id="Freeform 8" o:spid="_x0000_s1043" style="position:absolute;left:1187;top:51897;width:1984;height:7143;visibility:visible;mso-wrap-style:square;v-text-anchor:top" coordsize="125,450" o:gfxdata="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" path="m,l41,155,86,309r39,116l125,450,79,311,41,183,7,54,,xe" filled="f" strokecolor="#0e2841 [3215]" strokeweight="0">
+                  <v:shape id="Freeform 8" o:spid="_x0000_s1043" style="position:absolute;left:1187;top:51897;width:1984;height:7143;visibility:visible;mso-wrap-style:square;v-text-anchor:top" coordsize="125,450" o:gfxdata="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" path="m,l41,155,86,309r39,116l125,450,79,311,41,183,7,54,,xe" fillcolor="#c00000" strokecolor="#0e2841 [3215]" strokeweight="0">
+                    <v:fill opacity="13107f"/>
                     <v:stroke opacity="13107f"/>
                     <v:path arrowok="t" o:connecttype="custom" o:connectlocs="0,0;65088,246063;136525,490538;198438,674688;198438,714375;125413,493713;65088,290513;11113,85725;0,0" o:connectangles="0,0,0,0,0,0,0,0,0"/>
                   </v:shape>
-                  <v:shape id="Freeform 9" o:spid="_x0000_s1044" style="position:absolute;left:3282;top:58913;width:1874;height:4366;visibility:visible;mso-wrap-style:square;v-text-anchor:top" coordsize="118,275" o:gfxdata="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" path="m,l8,20,37,96r32,74l118,275r-9,l61,174,30,100,,26,,xe" filled="f" strokecolor="#0e2841 [3215]" strokeweight="0">
+                  <v:shape id="Freeform 9" o:spid="_x0000_s1044" style="position:absolute;left:3282;top:58913;width:1874;height:4366;visibility:visible;mso-wrap-style:square;v-text-anchor:top" coordsize="118,275" o:gfxdata="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" path="m,l8,20,37,96r32,74l118,275r-9,l61,174,30,100,,26,,xe" fillcolor="#c00000" strokecolor="#0e2841 [3215]" strokeweight="0">
+                    <v:fill opacity="13107f"/>
                     <v:stroke opacity="13107f"/>
                     <v:path arrowok="t" o:connecttype="custom" o:connectlocs="0,0;12700,31750;58738,152400;109538,269875;187325,436563;173038,436563;96838,276225;47625,158750;0,41275;0,0" o:connectangles="0,0,0,0,0,0,0,0,0,0"/>
                   </v:shape>
-                  <v:shape id="Freeform 10" o:spid="_x0000_s1045" style="position:absolute;left:806;top:50103;width:317;height:1921;visibility:visible;mso-wrap-style:square;v-text-anchor:top" coordsize="20,121" o:gfxdata="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" path="m,l16,72r4,49l18,112,,31,,xe" filled="f" strokecolor="#0e2841 [3215]" strokeweight="0">
+                  <v:shape id="Freeform 10" o:spid="_x0000_s1045" style="position:absolute;left:806;top:50103;width:317;height:1921;visibility:visible;mso-wrap-style:square;v-text-anchor:top" coordsize="20,121" o:gfxdata="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" path="m,l16,72r4,49l18,112,,31,,xe" fillcolor="#0e2841 [3215]" strokecolor="#0e2841 [3215]" strokeweight="0">
+                    <v:fill opacity="13107f"/>
                     <v:stroke opacity="13107f"/>
                     <v:path arrowok="t" o:connecttype="custom" o:connectlocs="0,0;25400,114300;31750,192088;28575,177800;0,49213;0,0" o:connectangles="0,0,0,0,0,0"/>
                   </v:shape>
-                  <v:shape id="Freeform 12" o:spid="_x0000_s1046" style="position:absolute;left:1123;top:52024;width:2509;height:10207;visibility:visible;mso-wrap-style:square;v-text-anchor:top" coordsize="158,643" o:gfxdata="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" path="m,l11,46r11,83l36,211r19,90l76,389r27,87l123,533r21,55l155,632r3,11l142,608,118,544,95,478,69,391,47,302,29,212,13,107,,xe" filled="f" strokecolor="#0e2841 [3215]" strokeweight="0">
+                  <v:shape id="Freeform 12" o:spid="_x0000_s1046" style="position:absolute;left:1123;top:52024;width:2509;height:10207;visibility:visible;mso-wrap-style:square;v-text-anchor:top" coordsize="158,643" o:gfxdata="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" path="m,l11,46r11,83l36,211r19,90l76,389r27,87l123,533r21,55l155,632r3,11l142,608,118,544,95,478,69,391,47,302,29,212,13,107,,xe" fillcolor="#c00000" strokecolor="#0e2841 [3215]" strokeweight="0">
+                    <v:fill opacity="13107f"/>
                     <v:stroke opacity="13107f"/>
                     <v:path arrowok="t" o:connecttype="custom" o:connectlocs="0,0;17463,73025;34925,204788;57150,334963;87313,477838;120650,617538;163513,755650;195263,846138;228600,933450;246063,1003300;250825,1020763;225425,965200;187325,863600;150813,758825;109538,620713;74613,479425;46038,336550;20638,169863;0,0" o:connectangles="0,0,0,0,0,0,0,0,0,0,0,0,0,0,0,0,0,0,0"/>
                   </v:shape>
-                  <v:shape id="Freeform 13" o:spid="_x0000_s1047" style="position:absolute;left:3759;top:62152;width:524;height:1127;visibility:visible;mso-wrap-style:square;v-text-anchor:top" coordsize="33,71" o:gfxdata="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" path="m,l33,71r-9,l11,36,,xe" filled="f" strokecolor="#0e2841 [3215]" strokeweight="0">
+                  <v:shape id="Freeform 13" o:spid="_x0000_s1047" style="position:absolute;left:3759;top:62152;width:524;height:1127;visibility:visible;mso-wrap-style:square;v-text-anchor:top" coordsize="33,71" o:gfxdata="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" path="m,l33,71r-9,l11,36,,xe" fillcolor="#0e2841 [3215]" strokecolor="#0e2841 [3215]" strokeweight="0">
+                    <v:fill opacity="13107f"/>
                     <v:stroke opacity="13107f"/>
                     <v:path arrowok="t" o:connecttype="custom" o:connectlocs="0,0;52388,112713;38100,112713;17463,57150;0,0" o:connectangles="0,0,0,0,0"/>
                   </v:shape>
-                  <v:shape id="Freeform 14" o:spid="_x0000_s1048" style="position:absolute;left:1060;top:51246;width:238;height:1508;visibility:visible;mso-wrap-style:square;v-text-anchor:top" coordsize="15,95" o:gfxdata="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" path="m,l8,37r,4l15,95,4,49,,xe" filled="f" strokecolor="#0e2841 [3215]" strokeweight="0">
+                  <v:shape id="Freeform 14" o:spid="_x0000_s1048" style="position:absolute;left:1060;top:51246;width:238;height:1508;visibility:visible;mso-wrap-style:square;v-text-anchor:top" coordsize="15,95" o:gfxdata="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" path="m,l8,37r,4l15,95,4,49,,xe" fillcolor="#0e2841 [3215]" strokecolor="#0e2841 [3215]" strokeweight="0">
+                    <v:fill opacity="13107f"/>
                     <v:stroke opacity="13107f"/>
                     <v:path arrowok="t" o:connecttype="custom" o:connectlocs="0,0;12700,58738;12700,65088;23813,150813;6350,77788;0,0" o:connectangles="0,0,0,0,0,0"/>
                   </v:shape>
-                  <v:shape id="Freeform 15" o:spid="_x0000_s1049" style="position:absolute;left:3171;top:46499;width:6382;height:12414;visibility:visible;mso-wrap-style:square;v-text-anchor:top" coordsize="402,782" o:gfxdata="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" path="m402,r,1l363,39,325,79r-35,42l255,164r-44,58l171,284r-38,62l100,411,71,478,45,546,27,617,13,689,7,761r,21l,765r1,-4l7,688,21,616,40,545,66,475,95,409r35,-66l167,281r42,-61l253,163r34,-43l324,78,362,38,402,xe" filled="f" strokecolor="#0e2841 [3215]" strokeweight="0">
+                  <v:shape id="Freeform 15" o:spid="_x0000_s1049" style="position:absolute;left:3171;top:46499;width:6382;height:12414;visibility:visible;mso-wrap-style:square;v-text-anchor:top" coordsize="402,782" o:gfxdata="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" path="m402,r,1l363,39,325,79r-35,42l255,164r-44,58l171,284r-38,62l100,411,71,478,45,546,27,617,13,689,7,761r,21l,765r1,-4l7,688,21,616,40,545,66,475,95,409r35,-66l167,281r42,-61l253,163r34,-43l324,78,362,38,402,xe" fillcolor="#c00000" strokecolor="#0e2841 [3215]" strokeweight="0">
+                    <v:fill opacity="13107f"/>
                     <v:stroke opacity="13107f"/>
                     <v:path arrowok="t" o:connecttype="custom" o:connectlocs="638175,0;638175,1588;576263,61913;515938,125413;460375,192088;404813,260350;334963,352425;271463,450850;211138,549275;158750,652463;112713,758825;71438,866775;42863,979488;20638,1093788;11113,1208088;11113,1241425;0,1214438;1588,1208088;11113,1092200;33338,977900;63500,865188;104775,754063;150813,649288;206375,544513;265113,446088;331788,349250;401638,258763;455613,190500;514350,123825;574675,60325;638175,0" o:connectangles="0,0,0,0,0,0,0,0,0,0,0,0,0,0,0,0,0,0,0,0,0,0,0,0,0,0,0,0,0,0,0"/>
                   </v:shape>
-                  <v:shape id="Freeform 16" o:spid="_x0000_s1050" style="position:absolute;left:3171;top:59040;width:588;height:3112;visibility:visible;mso-wrap-style:square;v-text-anchor:top" coordsize="37,196" o:gfxdata="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" path="m,l6,15r1,3l12,80r9,54l33,188r4,8l22,162,15,146,5,81,1,40,,xe" filled="f" strokecolor="#0e2841 [3215]" strokeweight="0">
+                  <v:shape id="Freeform 16" o:spid="_x0000_s1050" style="position:absolute;left:3171;top:59040;width:588;height:3112;visibility:visible;mso-wrap-style:square;v-text-anchor:top" coordsize="37,196" o:gfxdata="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" path="m,l6,15r1,3l12,80r9,54l33,188r4,8l22,162,15,146,5,81,1,40,,xe" fillcolor="#0e2841 [3215]" strokecolor="#0e2841 [3215]" strokeweight="0">
+                    <v:fill opacity="13107f"/>
                     <v:stroke opacity="13107f"/>
                     <v:path arrowok="t" o:connecttype="custom" o:connectlocs="0,0;9525,23813;11113,28575;19050,127000;33338,212725;52388,298450;58738,311150;34925,257175;23813,231775;7938,128588;1588,63500;0,0" o:connectangles="0,0,0,0,0,0,0,0,0,0,0,0"/>
                   </v:shape>
-                  <v:shape id="Freeform 17" o:spid="_x0000_s1051" style="position:absolute;left:3632;top:62231;width:492;height:1048;visibility:visible;mso-wrap-style:square;v-text-anchor:top" coordsize="31,66" o:gfxdata="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" path="m,l31,66r-7,l,xe" filled="f" strokecolor="#0e2841 [3215]" strokeweight="0">
+                  <v:shape id="Freeform 17" o:spid="_x0000_s1051" style="position:absolute;left:3632;top:62231;width:492;height:1048;visibility:visible;mso-wrap-style:square;v-text-anchor:top" coordsize="31,66" o:gfxdata="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" path="m,l31,66r-7,l,xe" fillcolor="#0e2841 [3215]" strokecolor="#0e2841 [3215]" strokeweight="0">
+                    <v:fill opacity="13107f"/>
                     <v:stroke opacity="13107f"/>
                     <v:path arrowok="t" o:connecttype="custom" o:connectlocs="0,0;49213,104775;38100,104775;0,0" o:connectangles="0,0,0,0"/>
                   </v:shape>
-                  <v:shape id="Freeform 18" o:spid="_x0000_s1052" style="position:absolute;left:3171;top:58644;width:111;height:682;visibility:visible;mso-wrap-style:square;v-text-anchor:top" coordsize="7,43" o:gfxdata="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" path="m,l7,17r,26l6,40,,25,,xe" filled="f" strokecolor="#0e2841 [3215]" strokeweight="0">
+                  <v:shape id="Freeform 18" o:spid="_x0000_s1052" style="position:absolute;left:3171;top:58644;width:111;height:682;visibility:visible;mso-wrap-style:square;v-text-anchor:top" coordsize="7,43" o:gfxdata="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" path="m,l7,17r,26l6,40,,25,,xe" fillcolor="#0e2841 [3215]" strokecolor="#0e2841 [3215]" strokeweight="0">
+                    <v:fill opacity="13107f"/>
                     <v:stroke opacity="13107f"/>
                     <v:path arrowok="t" o:connecttype="custom" o:connectlocs="0,0;11113,26988;11113,68263;9525,63500;0,39688;0,0" o:connectangles="0,0,0,0,0,0"/>
                   </v:shape>
-                  <v:shape id="Freeform 19" o:spid="_x0000_s1053" style="position:absolute;left:3409;top:61358;width:731;height:1921;visibility:visible;mso-wrap-style:square;v-text-anchor:top" coordsize="46,121" o:gfxdata="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" path="m,l7,16,22,50,33,86r13,35l45,121,14,55,11,44,,xe" filled="f" strokecolor="#0e2841 [3215]" strokeweight="0">
+                  <v:shape id="Freeform 19" o:spid="_x0000_s1053" style="position:absolute;left:3409;top:61358;width:731;height:1921;visibility:visible;mso-wrap-style:square;v-text-anchor:top" coordsize="46,121" o:gfxdata="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" path="m,l7,16,22,50,33,86r13,35l45,121,14,55,11,44,,xe" fillcolor="#c00000" strokecolor="#0e2841 [3215]" strokeweight="0">
+                    <v:fill opacity="13107f"/>
                     <v:stroke opacity="13107f"/>
                     <v:path arrowok="t" o:connecttype="custom" o:connectlocs="0,0;11113,25400;34925,79375;52388,136525;73025,192088;71438,192088;22225,87313;17463,69850;0,0" o:connectangles="0,0,0,0,0,0,0,0,0"/>
                   </v:shape>
@@ -9795,7 +9818,7 @@
 
 <file path=customXml/item1.xml><?xml version="1.0" encoding="utf-8"?>
 <CoverPageProperties xmlns="http://schemas.microsoft.com/office/2006/coverPageProps">
-  <PublishDate>2026-06-24T00:00:00</PublishDate>
+  <PublishDate/>
   <Abstract/>
   <CompanyAddress/>
   <CompanyPhone/>
@@ -9805,10 +9828,6 @@
 </file>
 
 <file path=customXml/item2.xml><?xml version="1.0" encoding="utf-8"?>
-<b:Sources xmlns:b="http://schemas.openxmlformats.org/officeDocument/2006/bibliography" xmlns="http://schemas.openxmlformats.org/officeDocument/2006/bibliography" SelectedStyle="/APASixthEditionOfficeOnline.xsl" StyleName="APA" Version="6"/>
-</file>
-
-<file path=customXml/item3.xml><?xml version="1.0" encoding="utf-8"?>
 <?mso-contentType ?>
 <FormTemplates xmlns="http://schemas.microsoft.com/sharepoint/v3/contenttype/forms">
   <Display>DocumentLibraryForm</Display>
@@ -9817,27 +9836,11 @@
 </FormTemplates>
 </file>
 
-<file path=customXml/item4.xml><?xml version="1.0" encoding="utf-8"?>
-<p:properties xmlns:p="http://schemas.microsoft.com/office/2006/metadata/properties" xmlns:xsi="http://www.w3.org/2001/XMLSchema-instance" xmlns:pc="http://schemas.microsoft.com/office/infopath/2007/PartnerControls">
-  <documentManagement>
-    <_ip_UnifiedCompliancePolicyUIAction xmlns="http://schemas.microsoft.com/sharepoint/v3" xsi:nil="true"/>
-    <Image xmlns="71af3243-3dd4-4a8d-8c0d-dd76da1f02a5">
-      <Url xsi:nil="true"/>
-      <Description xsi:nil="true"/>
-    </Image>
-    <Status xmlns="71af3243-3dd4-4a8d-8c0d-dd76da1f02a5">Not started</Status>
-    <Background xmlns="71af3243-3dd4-4a8d-8c0d-dd76da1f02a5">false</Background>
-    <_ip_UnifiedCompliancePolicyProperties xmlns="http://schemas.microsoft.com/sharepoint/v3" xsi:nil="true"/>
-    <ImageTagsTaxHTField xmlns="71af3243-3dd4-4a8d-8c0d-dd76da1f02a5">
-      <Terms xmlns="http://schemas.microsoft.com/office/infopath/2007/PartnerControls"/>
-    </ImageTagsTaxHTField>
-    <TaxCatchAll xmlns="230e9df3-be65-4c73-a93b-d1236ebd677e" xsi:nil="true"/>
-    <MediaServiceKeyPoints xmlns="71af3243-3dd4-4a8d-8c0d-dd76da1f02a5" xsi:nil="true"/>
-  </documentManagement>
-</p:properties>
+<file path=customXml/item3.xml><?xml version="1.0" encoding="utf-8"?>
+<b:Sources xmlns:b="http://schemas.openxmlformats.org/officeDocument/2006/bibliography" xmlns="http://schemas.openxmlformats.org/officeDocument/2006/bibliography" SelectedStyle="/APASixthEditionOfficeOnline.xsl" StyleName="APA" Version="6"/>
 </file>
 
-<file path=customXml/item5.xml><?xml version="1.0" encoding="utf-8"?>
+<file path=customXml/item4.xml><?xml version="1.0" encoding="utf-8"?>
 <ct:contentTypeSchema xmlns:ct="http://schemas.microsoft.com/office/2006/metadata/contentType" xmlns:ma="http://schemas.microsoft.com/office/2006/metadata/properties/metaAttributes" ct:_="" ma:_="" ma:contentTypeName="Document" ma:contentTypeID="0x01010079F111ED35F8CC479449609E8A0923A6" ma:contentTypeVersion="30" ma:contentTypeDescription="Create a new document." ma:contentTypeScope="" ma:versionID="cec0622158e8f13124e9e8fd4de31bd1">
   <xsd:schema xmlns:xsd="http://www.w3.org/2001/XMLSchema" xmlns:xs="http://www.w3.org/2001/XMLSchema" xmlns:p="http://schemas.microsoft.com/office/2006/metadata/properties" xmlns:ns1="http://schemas.microsoft.com/sharepoint/v3" xmlns:ns2="71af3243-3dd4-4a8d-8c0d-dd76da1f02a5" xmlns:ns3="16c05727-aa75-4e4a-9b5f-8a80a1165891" xmlns:ns4="230e9df3-be65-4c73-a93b-d1236ebd677e" targetNamespace="http://schemas.microsoft.com/office/2006/metadata/properties" ma:root="true" ma:fieldsID="3b52f30ab005d15df08657af532e6e38" ns1:_="" ns2:_="" ns3:_="" ns4:_="">
     <xsd:import namespace="http://schemas.microsoft.com/sharepoint/v3"/>
@@ -10155,6 +10158,26 @@
 </ct:contentTypeSchema>
 </file>
 
+<file path=customXml/item5.xml><?xml version="1.0" encoding="utf-8"?>
+<p:properties xmlns:p="http://schemas.microsoft.com/office/2006/metadata/properties" xmlns:xsi="http://www.w3.org/2001/XMLSchema-instance" xmlns:pc="http://schemas.microsoft.com/office/infopath/2007/PartnerControls">
+  <documentManagement>
+    <_ip_UnifiedCompliancePolicyUIAction xmlns="http://schemas.microsoft.com/sharepoint/v3" xsi:nil="true"/>
+    <Image xmlns="71af3243-3dd4-4a8d-8c0d-dd76da1f02a5">
+      <Url xsi:nil="true"/>
+      <Description xsi:nil="true"/>
+    </Image>
+    <Status xmlns="71af3243-3dd4-4a8d-8c0d-dd76da1f02a5">Not started</Status>
+    <Background xmlns="71af3243-3dd4-4a8d-8c0d-dd76da1f02a5">false</Background>
+    <_ip_UnifiedCompliancePolicyProperties xmlns="http://schemas.microsoft.com/sharepoint/v3" xsi:nil="true"/>
+    <ImageTagsTaxHTField xmlns="71af3243-3dd4-4a8d-8c0d-dd76da1f02a5">
+      <Terms xmlns="http://schemas.microsoft.com/office/infopath/2007/PartnerControls"/>
+    </ImageTagsTaxHTField>
+    <TaxCatchAll xmlns="230e9df3-be65-4c73-a93b-d1236ebd677e" xsi:nil="true"/>
+    <MediaServiceKeyPoints xmlns="71af3243-3dd4-4a8d-8c0d-dd76da1f02a5" xsi:nil="true"/>
+  </documentManagement>
+</p:properties>
+</file>
+
 <file path=customXml/itemProps1.xml><?xml version="1.0" encoding="utf-8"?>
 <ds:datastoreItem xmlns:ds="http://schemas.openxmlformats.org/officeDocument/2006/customXml" ds:itemID="{55AF091B-3C7A-41E3-B477-F2FDAA23CFDA}">
   <ds:schemaRefs>
@@ -10164,6 +10187,14 @@
 </file>
 
 <file path=customXml/itemProps2.xml><?xml version="1.0" encoding="utf-8"?>
+<ds:datastoreItem xmlns:ds="http://schemas.openxmlformats.org/officeDocument/2006/customXml" ds:itemID="{5D5F9B9C-5DD6-48B7-8D8E-B95F0BA12560}">
+  <ds:schemaRefs>
+    <ds:schemaRef ds:uri="http://schemas.microsoft.com/sharepoint/v3/contenttype/forms"/>
+  </ds:schemaRefs>
+</ds:datastoreItem>
+</file>
+
+<file path=customXml/itemProps3.xml><?xml version="1.0" encoding="utf-8"?>
 <ds:datastoreItem xmlns:ds="http://schemas.openxmlformats.org/officeDocument/2006/customXml" ds:itemID="{472D6006-AE70-8C4D-9BA0-029BC6376BBE}">
   <ds:schemaRefs>
     <ds:schemaRef ds:uri="http://schemas.openxmlformats.org/officeDocument/2006/bibliography"/>
@@ -10171,27 +10202,7 @@
 </ds:datastoreItem>
 </file>
 
-<file path=customXml/itemProps3.xml><?xml version="1.0" encoding="utf-8"?>
-<ds:datastoreItem xmlns:ds="http://schemas.openxmlformats.org/officeDocument/2006/customXml" ds:itemID="{5D5F9B9C-5DD6-48B7-8D8E-B95F0BA12560}">
-  <ds:schemaRefs>
-    <ds:schemaRef ds:uri="http://schemas.microsoft.com/sharepoint/v3/contenttype/forms"/>
-  </ds:schemaRefs>
-</ds:datastoreItem>
-</file>
-
 <file path=customXml/itemProps4.xml><?xml version="1.0" encoding="utf-8"?>
-<ds:datastoreItem xmlns:ds="http://schemas.openxmlformats.org/officeDocument/2006/customXml" ds:itemID="{1423AC32-003E-403C-A4AE-FF5A56A188F5}">
-  <ds:schemaRefs>
-    <ds:schemaRef ds:uri="http://schemas.microsoft.com/office/2006/metadata/properties"/>
-    <ds:schemaRef ds:uri="http://schemas.microsoft.com/office/infopath/2007/PartnerControls"/>
-    <ds:schemaRef ds:uri="http://schemas.microsoft.com/sharepoint/v3"/>
-    <ds:schemaRef ds:uri="71af3243-3dd4-4a8d-8c0d-dd76da1f02a5"/>
-    <ds:schemaRef ds:uri="230e9df3-be65-4c73-a93b-d1236ebd677e"/>
-  </ds:schemaRefs>
-</ds:datastoreItem>
-</file>
-
-<file path=customXml/itemProps5.xml><?xml version="1.0" encoding="utf-8"?>
 <ds:datastoreItem xmlns:ds="http://schemas.openxmlformats.org/officeDocument/2006/customXml" ds:itemID="{19B393CF-F867-4A5F-A744-EAB4BF3FF75E}">
   <ds:schemaRefs>
     <ds:schemaRef ds:uri="http://schemas.microsoft.com/office/2006/metadata/contentType"/>
@@ -10212,6 +10223,18 @@
 </ds:datastoreItem>
 </file>
 
+<file path=customXml/itemProps5.xml><?xml version="1.0" encoding="utf-8"?>
+<ds:datastoreItem xmlns:ds="http://schemas.openxmlformats.org/officeDocument/2006/customXml" ds:itemID="{1423AC32-003E-403C-A4AE-FF5A56A188F5}">
+  <ds:schemaRefs>
+    <ds:schemaRef ds:uri="http://schemas.microsoft.com/office/2006/metadata/properties"/>
+    <ds:schemaRef ds:uri="http://schemas.microsoft.com/office/infopath/2007/PartnerControls"/>
+    <ds:schemaRef ds:uri="http://schemas.microsoft.com/sharepoint/v3"/>
+    <ds:schemaRef ds:uri="71af3243-3dd4-4a8d-8c0d-dd76da1f02a5"/>
+    <ds:schemaRef ds:uri="230e9df3-be65-4c73-a93b-d1236ebd677e"/>
+  </ds:schemaRefs>
+</ds:datastoreItem>
+</file>
+
 <file path=docMetadata/LabelInfo.xml><?xml version="1.0" encoding="utf-8"?>
 <clbl:labelList xmlns:clbl="http://schemas.microsoft.com/office/2020/mipLabelMetadata">
   <clbl:label id="{d4def53c-905d-442a-ba22-72ae0f5bcf4f}" enabled="1" method="Standard" siteId="{6c637512-c417-4e78-9d62-b61258e4b619}" removed="0"/>

</xml_diff>